<commit_message>
Leppington BUYNSW-T026-2026: final RevF fee proposal to architect and returnable inputs
Co-Authored-By: Claude Opus 5.5 <noreply@anthropic.com>
Claude-Session: https://claude.ai/code/session_01RKGFyarCMuMinKYL7AiBap
</commit_message>
<xml_diff>
--- a/FP/BUYNSW-T026-2026/Final/JCE_FP_BUYNSW-T026-2026_to_Architect_Final_RevF.docx
+++ b/FP/BUYNSW-T026-2026/Final/JCE_FP_BUYNSW-T026-2026_to_Architect_Final_RevF.docx
@@ -969,7 +969,7 @@
               <w:rPr>
                 <w:sz w:val="17"/>
               </w:rPr>
-              <w:t>Early workshop with Council and the remediation consultant in Phase 1; levels model built so cell and capping levels can be revised quickly; RFI 3 and 4 lodged before 28/10/2026</w:t>
+              <w:t>Early workshop with Council and the remediation consultant in Phase 1; levels model built so cell and capping levels can be revised quickly; questions 2 and 3 to Council lodged before 28/10/2026</w:t>
             </w:r>
           </w:p>
         </w:tc>
@@ -1008,7 +1008,7 @@
               <w:rPr>
                 <w:sz w:val="17"/>
               </w:rPr>
-              <w:t>Obtain the road and GroupGSA designs in CAD at inception (RFI 6); interface levels agreed in writing at the end of Phase 1</w:t>
+              <w:t>Obtain the road and GroupGSA designs in CAD at inception (question 5 to Council); interface levels agreed in writing at the end of Phase 1</w:t>
             </w:r>
           </w:p>
         </w:tc>
@@ -1047,7 +1047,7 @@
               <w:rPr>
                 <w:sz w:val="17"/>
               </w:rPr>
-              <w:t>Confirm with Council (RFI 5) before the stormwater strategy is fixed; MUSIC-Link model prepared to Council's targets</w:t>
+              <w:t>Confirm with Council (question 4) before the stormwater strategy is fixed; MUSIC-Link model prepared to Council's targets</w:t>
             </w:r>
           </w:p>
         </w:tc>
@@ -7204,7 +7204,7 @@
               <w:rPr>
                 <w:sz w:val="17"/>
               </w:rPr>
-              <w:t>Western Sydney International Airport Business Precinct Stage One, Badgerys Creek NSW</w:t>
+              <w:t>Western Sydney International Airport Business Precinct Stage One, Western Sydney NSW</w:t>
             </w:r>
           </w:p>
         </w:tc>
@@ -8162,7 +8162,7 @@
     </w:p>
     <w:p>
       <w:r>
-        <w:t>Site and outcomes. The 12,000 m2 precinct sits on contaminated former land at the corner of Heath Road and Rickard Road, between the raised Heath Road, a future widened Rickard Road and the Scalabrini Creek open space. The civil outcome Council needs is a set of finished levels that contain the contamination under capping, give accessible grades to the plaza, car park and paths, match the road and open-space edges, and drain to a lawful outlet with MUSIC-Link compliant treatment, within the Stage 1 budget.</w:t>
+        <w:t>Site and outcomes. The 12,000 m2 precinct sits on contaminated land at the corner of Heath Road and Rickard Road, between the raised Heath Road, a future widened Rickard Road and the Scalabrini Creek open space. The civil outcome Council needs is a set of finished levels that contain the contamination under capping, give accessible grades to the plaza, car park and paths, match the road and open-space edges, and drain to a lawful outlet with MUSIC-Link compliant treatment, within the Stage 1 budget.</w:t>
       </w:r>
     </w:p>
     <w:p>

</xml_diff>